<commit_message>
docs: README y tabla de endpoints con la base de datos y el horario
</commit_message>
<xml_diff>
--- a/docs/endpoints.docx
+++ b/docs/endpoints.docx
@@ -62,7 +62,7 @@
           <w:b w:val="0"/>
           <w:sz w:val="22"/>
         </w:rPr>
-        <w:t>El sistema está dividido en dos microservicios hechos con Spring Boot. Cada uno corre en su propio puerto, tiene sus propios controllers y guarda sus datos por separado. A continuación listamos los endpoints de cada controller.</w:t>
+        <w:t>El sistema está dividido en dos microservicios hechos con Spring Boot. Cada uno corre en su propio puerto, tiene sus propios controllers y guarda sus datos en su propio esquema de una base de datos PostgreSQL en Supabase: catalogo y citas. A continuación listamos los endpoints de cada controller.</w:t>
       </w:r>
     </w:p>
     <w:tbl>
@@ -253,7 +253,7 @@
               <w:rPr>
                 <w:sz w:val="21"/>
               </w:rPr>
-              <w:t>Clientes y citas. Para agendar una cita consulta a api-catalogo.</w:t>
+              <w:t>Clientes, citas y horario de atención. Para agendar una cita consulta a api-catalogo.</w:t>
             </w:r>
           </w:p>
         </w:tc>
@@ -769,7 +769,7 @@
               <w:rPr>
                 <w:sz w:val="21"/>
               </w:rPr>
-              <w:t>Eliminar servicio</w:t>
+              <w:t>Eliminar servicio (se rechaza si tiene citas programadas: lo pregunta a api-citas)</w:t>
             </w:r>
           </w:p>
         </w:tc>
@@ -1271,7 +1271,7 @@
               <w:rPr>
                 <w:sz w:val="21"/>
               </w:rPr>
-              <w:t>Eliminar barbero</w:t>
+              <w:t>Eliminar barbero (se rechaza si tiene citas programadas: lo pregunta a api-citas)</w:t>
             </w:r>
           </w:p>
         </w:tc>
@@ -2175,7 +2175,7 @@
               <w:rPr>
                 <w:sz w:val="21"/>
               </w:rPr>
-              <w:t>Agendar cita. Consulta el servicio y el barbero en api-catalogo</w:t>
+              <w:t>Agendar cita. Consulta el servicio y el barbero en api-catalogo y valida el horario de atención</w:t>
             </w:r>
           </w:p>
         </w:tc>
@@ -2254,7 +2254,7 @@
               <w:rPr>
                 <w:sz w:val="21"/>
               </w:rPr>
-              <w:t>Listar citas</w:t>
+              <w:t>Listar citas. Filtros opcionales: clienteId, barberoId, servicioId, estado y fecha</w:t>
             </w:r>
           </w:p>
         </w:tc>
@@ -2563,6 +2563,279 @@
                 <w:sz w:val="21"/>
               </w:rPr>
               <w:t>Eliminar cita</w:t>
+            </w:r>
+          </w:p>
+        </w:tc>
+      </w:tr>
+    </w:tbl>
+    <w:p>
+      <w:pPr>
+        <w:spacing w:after="40"/>
+      </w:pPr>
+    </w:p>
+    <w:p>
+      <w:pPr>
+        <w:keepNext/>
+        <w:spacing w:after="120" w:before="120"/>
+      </w:pPr>
+      <w:r>
+        <w:rPr>
+          <w:b/>
+          <w:color w:val="16243A"/>
+          <w:sz w:val="24"/>
+        </w:rPr>
+        <w:t>HorarioController</w:t>
+      </w:r>
+    </w:p>
+    <w:tbl>
+      <w:tblPr>
+        <w:tblStyle w:val="TableGrid"/>
+        <w:tblW w:type="auto" w:w="0"/>
+        <w:jc w:val="center"/>
+        <w:tblLayout w:type="fixed"/>
+        <w:tblLook w:firstColumn="1" w:firstRow="1" w:lastColumn="0" w:lastRow="0" w:noHBand="0" w:noVBand="1" w:val="04A0"/>
+      </w:tblPr>
+      <w:tblGrid>
+        <w:gridCol w:w="2436"/>
+        <w:gridCol w:w="2436"/>
+        <w:gridCol w:w="2436"/>
+        <w:gridCol w:w="2436"/>
+      </w:tblGrid>
+      <w:tr>
+        <w:trPr>
+          <w:cantSplit/>
+        </w:trPr>
+        <w:tc>
+          <w:tcPr>
+            <w:tcW w:type="dxa" w:w="1701"/>
+            <w:shd w:val="clear" w:color="auto" w:fill="16243A"/>
+          </w:tcPr>
+          <w:p>
+            <w:pPr>
+              <w:keepNext/>
+              <w:spacing w:after="40" w:before="40"/>
+            </w:pPr>
+            <w:r>
+              <w:rPr>
+                <w:b/>
+                <w:color w:val="FFFFFF"/>
+                <w:sz w:val="21"/>
+              </w:rPr>
+              <w:t>Microservicio</w:t>
+            </w:r>
+          </w:p>
+        </w:tc>
+        <w:tc>
+          <w:tcPr>
+            <w:tcW w:type="dxa" w:w="1134"/>
+            <w:shd w:val="clear" w:color="auto" w:fill="16243A"/>
+          </w:tcPr>
+          <w:p>
+            <w:pPr>
+              <w:keepNext/>
+              <w:spacing w:after="40" w:before="40"/>
+            </w:pPr>
+            <w:r>
+              <w:rPr>
+                <w:b/>
+                <w:color w:val="FFFFFF"/>
+                <w:sz w:val="21"/>
+              </w:rPr>
+              <w:t>Método</w:t>
+            </w:r>
+          </w:p>
+        </w:tc>
+        <w:tc>
+          <w:tcPr>
+            <w:tcW w:type="dxa" w:w="3061"/>
+            <w:shd w:val="clear" w:color="auto" w:fill="16243A"/>
+          </w:tcPr>
+          <w:p>
+            <w:pPr>
+              <w:keepNext/>
+              <w:spacing w:after="40" w:before="40"/>
+            </w:pPr>
+            <w:r>
+              <w:rPr>
+                <w:b/>
+                <w:color w:val="FFFFFF"/>
+                <w:sz w:val="21"/>
+              </w:rPr>
+              <w:t>Endpoint</w:t>
+            </w:r>
+          </w:p>
+        </w:tc>
+        <w:tc>
+          <w:tcPr>
+            <w:tcW w:type="dxa" w:w="3515"/>
+            <w:shd w:val="clear" w:color="auto" w:fill="16243A"/>
+          </w:tcPr>
+          <w:p>
+            <w:pPr>
+              <w:keepNext/>
+              <w:spacing w:after="40" w:before="40"/>
+            </w:pPr>
+            <w:r>
+              <w:rPr>
+                <w:b/>
+                <w:color w:val="FFFFFF"/>
+                <w:sz w:val="21"/>
+              </w:rPr>
+              <w:t>Descripción</w:t>
+            </w:r>
+          </w:p>
+        </w:tc>
+      </w:tr>
+      <w:tr>
+        <w:trPr>
+          <w:cantSplit/>
+        </w:trPr>
+        <w:tc>
+          <w:tcPr>
+            <w:tcW w:type="dxa" w:w="1701"/>
+          </w:tcPr>
+          <w:p>
+            <w:pPr>
+              <w:keepNext/>
+              <w:spacing w:after="40" w:before="40"/>
+            </w:pPr>
+            <w:r>
+              <w:rPr>
+                <w:sz w:val="21"/>
+              </w:rPr>
+              <w:t>Citas</w:t>
+            </w:r>
+          </w:p>
+        </w:tc>
+        <w:tc>
+          <w:tcPr>
+            <w:tcW w:type="dxa" w:w="1134"/>
+          </w:tcPr>
+          <w:p>
+            <w:pPr>
+              <w:keepNext/>
+              <w:spacing w:after="40" w:before="40"/>
+            </w:pPr>
+            <w:r>
+              <w:rPr>
+                <w:b/>
+                <w:sz w:val="21"/>
+              </w:rPr>
+              <w:t>GET</w:t>
+            </w:r>
+          </w:p>
+        </w:tc>
+        <w:tc>
+          <w:tcPr>
+            <w:tcW w:type="dxa" w:w="3061"/>
+          </w:tcPr>
+          <w:p>
+            <w:pPr>
+              <w:keepNext/>
+              <w:spacing w:after="40" w:before="40"/>
+            </w:pPr>
+            <w:r>
+              <w:rPr>
+                <w:rFonts w:ascii="Consolas" w:hAnsi="Consolas"/>
+                <w:sz w:val="20"/>
+              </w:rPr>
+              <w:t>/api/horario</w:t>
+            </w:r>
+          </w:p>
+        </w:tc>
+        <w:tc>
+          <w:tcPr>
+            <w:tcW w:type="dxa" w:w="3515"/>
+          </w:tcPr>
+          <w:p>
+            <w:pPr>
+              <w:keepNext/>
+              <w:spacing w:after="40" w:before="40"/>
+            </w:pPr>
+            <w:r>
+              <w:rPr>
+                <w:sz w:val="21"/>
+              </w:rPr>
+              <w:t>Consultar el horario de atención de los siete días de la semana</w:t>
+            </w:r>
+          </w:p>
+        </w:tc>
+      </w:tr>
+      <w:tr>
+        <w:trPr>
+          <w:cantSplit/>
+        </w:trPr>
+        <w:tc>
+          <w:tcPr>
+            <w:tcW w:type="dxa" w:w="1701"/>
+            <w:shd w:val="clear" w:color="auto" w:fill="F3F5F8"/>
+          </w:tcPr>
+          <w:p>
+            <w:pPr>
+              <w:keepNext/>
+              <w:spacing w:after="40" w:before="40"/>
+            </w:pPr>
+            <w:r>
+              <w:rPr>
+                <w:sz w:val="21"/>
+              </w:rPr>
+              <w:t>Citas</w:t>
+            </w:r>
+          </w:p>
+        </w:tc>
+        <w:tc>
+          <w:tcPr>
+            <w:tcW w:type="dxa" w:w="1134"/>
+            <w:shd w:val="clear" w:color="auto" w:fill="F3F5F8"/>
+          </w:tcPr>
+          <w:p>
+            <w:pPr>
+              <w:keepNext/>
+              <w:spacing w:after="40" w:before="40"/>
+            </w:pPr>
+            <w:r>
+              <w:rPr>
+                <w:b/>
+                <w:sz w:val="21"/>
+              </w:rPr>
+              <w:t>PUT</w:t>
+            </w:r>
+          </w:p>
+        </w:tc>
+        <w:tc>
+          <w:tcPr>
+            <w:tcW w:type="dxa" w:w="3061"/>
+            <w:shd w:val="clear" w:color="auto" w:fill="F3F5F8"/>
+          </w:tcPr>
+          <w:p>
+            <w:pPr>
+              <w:keepNext/>
+              <w:spacing w:after="40" w:before="40"/>
+            </w:pPr>
+            <w:r>
+              <w:rPr>
+                <w:rFonts w:ascii="Consolas" w:hAnsi="Consolas"/>
+                <w:sz w:val="20"/>
+              </w:rPr>
+              <w:t>/api/horario/{diaSemana}</w:t>
+            </w:r>
+          </w:p>
+        </w:tc>
+        <w:tc>
+          <w:tcPr>
+            <w:tcW w:type="dxa" w:w="3515"/>
+            <w:shd w:val="clear" w:color="auto" w:fill="F3F5F8"/>
+          </w:tcPr>
+          <w:p>
+            <w:pPr>
+              <w:keepNext/>
+              <w:spacing w:after="40" w:before="40"/>
+            </w:pPr>
+            <w:r>
+              <w:rPr>
+                <w:sz w:val="21"/>
+              </w:rPr>
+              <w:t>Cambiar la apertura y el cierre de un día (las dos en null: ese día no se atiende)</w:t>
             </w:r>
           </w:p>
         </w:tc>
@@ -2984,7 +3257,7 @@
           <w:b w:val="0"/>
           <w:sz w:val="22"/>
         </w:rPr>
-        <w:t>api-citas consume estos endpoints de api-catalogo con RestClient. La comunicación es síncrona: api-citas espera la respuesta antes de continuar. Si api-catalogo está apagado, api-citas responde 503.</w:t>
+        <w:t>Los dos microservicios se consultan con RestClient y la comunicación es síncrona: quien pregunta espera la respuesta antes de continuar. api-citas consulta a api-catalogo al agendar, y api-catalogo consulta a api-citas antes de eliminar un servicio o un barbero. Si el otro microservicio está apagado, se responde 503.</w:t>
       </w:r>
     </w:p>
     <w:tbl>
@@ -3315,6 +3588,156 @@
           </w:p>
         </w:tc>
       </w:tr>
+      <w:tr>
+        <w:trPr>
+          <w:cantSplit/>
+        </w:trPr>
+        <w:tc>
+          <w:tcPr>
+            <w:tcW w:type="dxa" w:w="1701"/>
+          </w:tcPr>
+          <w:p>
+            <w:pPr>
+              <w:keepNext/>
+              <w:spacing w:after="40" w:before="40"/>
+            </w:pPr>
+            <w:r>
+              <w:rPr>
+                <w:sz w:val="21"/>
+              </w:rPr>
+              <w:t>api-catalogo</w:t>
+            </w:r>
+          </w:p>
+        </w:tc>
+        <w:tc>
+          <w:tcPr>
+            <w:tcW w:type="dxa" w:w="1134"/>
+          </w:tcPr>
+          <w:p>
+            <w:pPr>
+              <w:keepNext/>
+              <w:spacing w:after="40" w:before="40"/>
+            </w:pPr>
+            <w:r>
+              <w:rPr>
+                <w:b/>
+                <w:sz w:val="21"/>
+              </w:rPr>
+              <w:t>GET</w:t>
+            </w:r>
+          </w:p>
+        </w:tc>
+        <w:tc>
+          <w:tcPr>
+            <w:tcW w:type="dxa" w:w="3061"/>
+          </w:tcPr>
+          <w:p>
+            <w:pPr>
+              <w:keepNext/>
+              <w:spacing w:after="40" w:before="40"/>
+            </w:pPr>
+            <w:r>
+              <w:rPr>
+                <w:rFonts w:ascii="Consolas" w:hAnsi="Consolas"/>
+                <w:sz w:val="20"/>
+              </w:rPr>
+              <w:t>/api/citas?servicioId={id}&amp;estado=PROGRAMADA</w:t>
+            </w:r>
+          </w:p>
+        </w:tc>
+        <w:tc>
+          <w:tcPr>
+            <w:tcW w:type="dxa" w:w="3515"/>
+          </w:tcPr>
+          <w:p>
+            <w:pPr>
+              <w:keepNext/>
+              <w:spacing w:after="40" w:before="40"/>
+            </w:pPr>
+            <w:r>
+              <w:rPr>
+                <w:sz w:val="21"/>
+              </w:rPr>
+              <w:t>Saber si un servicio tiene citas programadas antes de eliminarlo</w:t>
+            </w:r>
+          </w:p>
+        </w:tc>
+      </w:tr>
+      <w:tr>
+        <w:trPr>
+          <w:cantSplit/>
+        </w:trPr>
+        <w:tc>
+          <w:tcPr>
+            <w:tcW w:type="dxa" w:w="1701"/>
+          </w:tcPr>
+          <w:p>
+            <w:pPr>
+              <w:keepNext/>
+              <w:spacing w:after="40" w:before="40"/>
+            </w:pPr>
+            <w:r>
+              <w:rPr>
+                <w:sz w:val="21"/>
+              </w:rPr>
+              <w:t>api-catalogo</w:t>
+            </w:r>
+          </w:p>
+        </w:tc>
+        <w:tc>
+          <w:tcPr>
+            <w:tcW w:type="dxa" w:w="1134"/>
+          </w:tcPr>
+          <w:p>
+            <w:pPr>
+              <w:keepNext/>
+              <w:spacing w:after="40" w:before="40"/>
+            </w:pPr>
+            <w:r>
+              <w:rPr>
+                <w:b/>
+                <w:sz w:val="21"/>
+              </w:rPr>
+              <w:t>GET</w:t>
+            </w:r>
+          </w:p>
+        </w:tc>
+        <w:tc>
+          <w:tcPr>
+            <w:tcW w:type="dxa" w:w="3061"/>
+          </w:tcPr>
+          <w:p>
+            <w:pPr>
+              <w:keepNext/>
+              <w:spacing w:after="40" w:before="40"/>
+            </w:pPr>
+            <w:r>
+              <w:rPr>
+                <w:rFonts w:ascii="Consolas" w:hAnsi="Consolas"/>
+                <w:sz w:val="20"/>
+              </w:rPr>
+              <w:t>/api/citas?barberoId={id}&amp;estado=PROGRAMADA</w:t>
+            </w:r>
+          </w:p>
+        </w:tc>
+        <w:tc>
+          <w:tcPr>
+            <w:tcW w:type="dxa" w:w="3515"/>
+          </w:tcPr>
+          <w:p>
+            <w:pPr>
+              <w:keepNext/>
+              <w:spacing w:after="40" w:before="40"/>
+            </w:pPr>
+            <w:r>
+              <w:rPr>
+                <w:sz w:val="21"/>
+              </w:rPr>
+              <w:t>Saber si un barbero tiene citas programadas antes de eliminarlo</w:t>
+            </w:r>
+          </w:p>
+        </w:tc>
+      </w:tr>
     </w:tbl>
     <w:p>
       <w:pPr>
@@ -3582,7 +4005,7 @@
               <w:rPr>
                 <w:sz w:val="21"/>
               </w:rPr>
-              <w:t>Campos obligatorios vacíos, precio en cero, fecha pasada</w:t>
+              <w:t>Campos obligatorios vacíos, precio en cero, fecha pasada, cita fuera del horario de atención</w:t>
             </w:r>
           </w:p>
         </w:tc>
@@ -3699,7 +4122,7 @@
               <w:rPr>
                 <w:sz w:val="21"/>
               </w:rPr>
-              <w:t>Documento o nombre repetido, barbero ocupado a esa hora, cita ya cerrada</w:t>
+              <w:t>Documento o nombre repetido, barbero o cliente ocupado a esa hora, cita ya cerrada o que aún no empieza al completarla, servicio o barbero con citas programadas al eliminarlo</w:t>
             </w:r>
           </w:p>
         </w:tc>
@@ -3759,7 +4182,7 @@
               <w:rPr>
                 <w:sz w:val="21"/>
               </w:rPr>
-              <w:t>api-catalogo apagado al agendar una cita</w:t>
+              <w:t>api-catalogo apagado al agendar una cita, o api-citas apagado al eliminar un servicio o un barbero</w:t>
             </w:r>
           </w:p>
         </w:tc>

</xml_diff>